<commit_message>
docs: diagramas U03 completos (10) — Excalidraw + SVG insertados en los 10 capítulos ES+VA, DOCX/EPUB regenerados y PDF ES actualizado
</commit_message>
<xml_diff>
--- a/docx/es/03-variables-tipos-operadores/03-variables-tipos-operadores.docx
+++ b/docx/es/03-variables-tipos-operadores/03-variables-tipos-operadores.docx
@@ -2246,7 +2246,7 @@
     </w:p>
     <w:bookmarkEnd w:id="25"/>
     <w:bookmarkEnd w:id="26"/>
-    <w:bookmarkStart w:id="36" w:name="Xf2c4e9dd462771985bc53bca75a0a6e05eff77c"/>
+    <w:bookmarkStart w:id="39" w:name="Xf2c4e9dd462771985bc53bca75a0a6e05eff77c"/>
     <w:p>
       <w:pPr>
         <w:pStyle w:val="Heading1"/>
@@ -3302,7 +3302,7 @@
       </w:r>
     </w:p>
     <w:bookmarkEnd w:id="29"/>
-    <w:bookmarkStart w:id="30" w:name="Xa0fdb22f44b2ec945bce777070639df19d545be"/>
+    <w:bookmarkStart w:id="33" w:name="Xa0fdb22f44b2ec945bce777070639df19d545be"/>
     <w:p>
       <w:pPr>
         <w:pStyle w:val="Heading2"/>
@@ -4256,14 +4256,61 @@
       </w:r>
     </w:p>
     <w:p>
+      <w:pPr>
+        <w:pStyle w:val="FirstParagraph"/>
+      </w:pPr>
+      <w:r>
+        <w:drawing>
+          <wp:inline>
+            <wp:extent cx="5334000" cy="2941661"/>
+            <wp:effectExtent b="0" l="0" r="0" t="0"/>
+            <wp:docPr descr="Mapa de los 8 tipos primitivos de Java: familias de enteros, decimales, texto y lógica con sus bits y rangos" title="" id="31" name="Picture"/>
+            <a:graphic>
+              <a:graphicData uri="http://schemas.openxmlformats.org/drawingml/2006/picture">
+                <pic:pic>
+                  <pic:nvPicPr>
+                    <pic:cNvPr descr="C:/Users/serga/AppData/Local/Temp/opencode/docxgen/png/u03-map-tipo-primitivos.png" id="32" name="Picture"/>
+                    <pic:cNvPicPr>
+                      <a:picLocks noChangeArrowheads="1" noChangeAspect="1"/>
+                    </pic:cNvPicPr>
+                  </pic:nvPicPr>
+                  <pic:blipFill>
+                    <a:blip r:embed="rId30"/>
+                    <a:stretch>
+                      <a:fillRect/>
+                    </a:stretch>
+                  </pic:blipFill>
+                  <pic:spPr bwMode="auto">
+                    <a:xfrm>
+                      <a:off x="0" y="0"/>
+                      <a:ext cx="5334000" cy="2941661"/>
+                    </a:xfrm>
+                    <a:prstGeom prst="rect">
+                      <a:avLst/>
+                    </a:prstGeom>
+                    <a:noFill/>
+                    <a:ln w="9525">
+                      <a:noFill/>
+                      <a:headEnd/>
+                      <a:tailEnd/>
+                    </a:ln>
+                  </pic:spPr>
+                </pic:pic>
+              </a:graphicData>
+            </a:graphic>
+          </wp:inline>
+        </w:drawing>
+      </w:r>
+    </w:p>
+    <w:p>
       <w:r>
         <w:pict>
           <v:rect style="width:0;height:1.5pt" o:hralign="center" o:hrstd="t" o:hr="t"/>
         </w:pict>
       </w:r>
     </w:p>
-    <w:bookmarkEnd w:id="30"/>
-    <w:bookmarkStart w:id="31" w:name="Xa50e5a3c5d33d79418c337024568f3c98fe6e9d"/>
+    <w:bookmarkEnd w:id="33"/>
+    <w:bookmarkStart w:id="34" w:name="Xa50e5a3c5d33d79418c337024568f3c98fe6e9d"/>
     <w:p>
       <w:pPr>
         <w:pStyle w:val="Heading2"/>
@@ -4462,8 +4509,8 @@
         </w:pict>
       </w:r>
     </w:p>
-    <w:bookmarkEnd w:id="31"/>
-    <w:bookmarkStart w:id="32" w:name="star-sé-el-código-my-friend"/>
+    <w:bookmarkEnd w:id="34"/>
+    <w:bookmarkStart w:id="35" w:name="star-sé-el-código-my-friend"/>
     <w:p>
       <w:pPr>
         <w:pStyle w:val="Heading2"/>
@@ -5290,8 +5337,8 @@
         </w:pict>
       </w:r>
     </w:p>
-    <w:bookmarkEnd w:id="32"/>
-    <w:bookmarkStart w:id="33" w:name="dart-mini-chequeo"/>
+    <w:bookmarkEnd w:id="35"/>
+    <w:bookmarkStart w:id="36" w:name="dart-mini-chequeo"/>
     <w:p>
       <w:pPr>
         <w:pStyle w:val="Heading2"/>
@@ -5674,8 +5721,8 @@
         </w:pict>
       </w:r>
     </w:p>
-    <w:bookmarkEnd w:id="33"/>
-    <w:bookmarkStart w:id="35" w:name="white_check_mark-resumen-en-3-frases"/>
+    <w:bookmarkEnd w:id="36"/>
+    <w:bookmarkStart w:id="38" w:name="white_check_mark-resumen-en-3-frases"/>
     <w:p>
       <w:pPr>
         <w:pStyle w:val="Heading2"/>
@@ -6037,7 +6084,7 @@
       <w:r>
         <w:t xml:space="preserve"> </w:t>
       </w:r>
-      <w:hyperlink r:id="rId34">
+      <w:hyperlink r:id="rId37">
         <w:r>
           <w:rPr>
             <w:rStyle w:val="Hyperlink"/>
@@ -6064,7 +6111,7 @@
       <w:r>
         <w:t xml:space="preserve"> </w:t>
       </w:r>
-      <w:hyperlink r:id="rId34">
+      <w:hyperlink r:id="rId37">
         <w:r>
           <w:rPr>
             <w:rStyle w:val="Hyperlink"/>
@@ -6107,9 +6154,9 @@
         </w:pict>
       </w:r>
     </w:p>
-    <w:bookmarkEnd w:id="35"/>
-    <w:bookmarkEnd w:id="36"/>
-    <w:bookmarkStart w:id="46" w:name="X55a47ea3f668813e72ba19dde44fcb75bff5f47"/>
+    <w:bookmarkEnd w:id="38"/>
+    <w:bookmarkEnd w:id="39"/>
+    <w:bookmarkStart w:id="52" w:name="X55a47ea3f668813e72ba19dde44fcb75bff5f47"/>
     <w:p>
       <w:pPr>
         <w:pStyle w:val="Heading1"/>
@@ -6165,7 +6212,7 @@
         </w:pict>
       </w:r>
     </w:p>
-    <w:bookmarkStart w:id="37" w:name="mailbox_with_mail-la-idea-en-una-frase-1"/>
+    <w:bookmarkStart w:id="40" w:name="mailbox_with_mail-la-idea-en-una-frase-1"/>
     <w:p>
       <w:pPr>
         <w:pStyle w:val="Heading2"/>
@@ -6269,8 +6316,8 @@
         </w:pict>
       </w:r>
     </w:p>
-    <w:bookmarkEnd w:id="37"/>
-    <w:bookmarkStart w:id="38" w:name="X44c99840583361685d3ce3b91476171e6f3243b"/>
+    <w:bookmarkEnd w:id="40"/>
+    <w:bookmarkStart w:id="41" w:name="X44c99840583361685d3ce3b91476171e6f3243b"/>
     <w:p>
       <w:pPr>
         <w:pStyle w:val="Heading2"/>
@@ -6596,8 +6643,8 @@
         </w:pict>
       </w:r>
     </w:p>
-    <w:bookmarkEnd w:id="38"/>
-    <w:bookmarkStart w:id="39" w:name="X29384ec1ad5978886715bf11ab55fb0fc411e47"/>
+    <w:bookmarkEnd w:id="41"/>
+    <w:bookmarkStart w:id="42" w:name="X29384ec1ad5978886715bf11ab55fb0fc411e47"/>
     <w:p>
       <w:pPr>
         <w:pStyle w:val="Heading2"/>
@@ -6892,8 +6939,8 @@
         </w:pict>
       </w:r>
     </w:p>
-    <w:bookmarkEnd w:id="39"/>
-    <w:bookmarkStart w:id="40" w:name="magnet--vs-equals-la-trampa-clásica"/>
+    <w:bookmarkEnd w:id="42"/>
+    <w:bookmarkStart w:id="46" w:name="magnet--vs-equals-la-trampa-clásica"/>
     <w:p>
       <w:pPr>
         <w:pStyle w:val="Heading2"/>
@@ -7637,14 +7684,61 @@
       </w:r>
     </w:p>
     <w:p>
+      <w:pPr>
+        <w:pStyle w:val="FirstParagraph"/>
+      </w:pPr>
+      <w:r>
+        <w:drawing>
+          <wp:inline>
+            <wp:extent cx="5334000" cy="3454598"/>
+            <wp:effectExtent b="0" l="0" r="0" t="0"/>
+            <wp:docPr descr="Diagrama del pool de Strings: a y b apuntan al mismo objeto del pool y c a uno nuevo con new, con == comparando referencias y .equals() el contenido" title="" id="44" name="Picture"/>
+            <a:graphic>
+              <a:graphicData uri="http://schemas.openxmlformats.org/drawingml/2006/picture">
+                <pic:pic>
+                  <pic:nvPicPr>
+                    <pic:cNvPr descr="C:/Users/serga/AppData/Local/Temp/opencode/docxgen/png/u03-pool-strings.png" id="45" name="Picture"/>
+                    <pic:cNvPicPr>
+                      <a:picLocks noChangeArrowheads="1" noChangeAspect="1"/>
+                    </pic:cNvPicPr>
+                  </pic:nvPicPr>
+                  <pic:blipFill>
+                    <a:blip r:embed="rId43"/>
+                    <a:stretch>
+                      <a:fillRect/>
+                    </a:stretch>
+                  </pic:blipFill>
+                  <pic:spPr bwMode="auto">
+                    <a:xfrm>
+                      <a:off x="0" y="0"/>
+                      <a:ext cx="5334000" cy="3454598"/>
+                    </a:xfrm>
+                    <a:prstGeom prst="rect">
+                      <a:avLst/>
+                    </a:prstGeom>
+                    <a:noFill/>
+                    <a:ln w="9525">
+                      <a:noFill/>
+                      <a:headEnd/>
+                      <a:tailEnd/>
+                    </a:ln>
+                  </pic:spPr>
+                </pic:pic>
+              </a:graphicData>
+            </a:graphic>
+          </wp:inline>
+        </w:drawing>
+      </w:r>
+    </w:p>
+    <w:p>
       <w:r>
         <w:pict>
           <v:rect style="width:0;height:1.5pt" o:hralign="center" o:hrstd="t" o:hr="t"/>
         </w:pict>
       </w:r>
     </w:p>
-    <w:bookmarkEnd w:id="40"/>
-    <w:bookmarkStart w:id="41" w:name="Xab2d36023b01a70fa69d6cab7c4807b20389514"/>
+    <w:bookmarkEnd w:id="46"/>
+    <w:bookmarkStart w:id="47" w:name="Xab2d36023b01a70fa69d6cab7c4807b20389514"/>
     <w:p>
       <w:pPr>
         <w:pStyle w:val="Heading2"/>
@@ -7966,8 +8060,8 @@
         </w:pict>
       </w:r>
     </w:p>
-    <w:bookmarkEnd w:id="41"/>
-    <w:bookmarkStart w:id="42" w:name="X5c05fb8e1b8d8e35925ce9b68c69a7775b2a0d1"/>
+    <w:bookmarkEnd w:id="47"/>
+    <w:bookmarkStart w:id="48" w:name="X5c05fb8e1b8d8e35925ce9b68c69a7775b2a0d1"/>
     <w:p>
       <w:pPr>
         <w:pStyle w:val="Heading2"/>
@@ -8837,8 +8931,8 @@
         </w:pict>
       </w:r>
     </w:p>
-    <w:bookmarkEnd w:id="42"/>
-    <w:bookmarkStart w:id="43" w:name="star-sé-el-código-my-friend-1"/>
+    <w:bookmarkEnd w:id="48"/>
+    <w:bookmarkStart w:id="49" w:name="star-sé-el-código-my-friend-1"/>
     <w:p>
       <w:pPr>
         <w:pStyle w:val="Heading2"/>
@@ -9490,8 +9584,8 @@
         </w:pict>
       </w:r>
     </w:p>
-    <w:bookmarkEnd w:id="43"/>
-    <w:bookmarkStart w:id="44" w:name="dart-mini-chequeo-1"/>
+    <w:bookmarkEnd w:id="49"/>
+    <w:bookmarkStart w:id="50" w:name="dart-mini-chequeo-1"/>
     <w:p>
       <w:pPr>
         <w:pStyle w:val="Heading2"/>
@@ -9834,8 +9928,8 @@
         </w:pict>
       </w:r>
     </w:p>
-    <w:bookmarkEnd w:id="44"/>
-    <w:bookmarkStart w:id="45" w:name="white_check_mark-resumen-en-3-frases-1"/>
+    <w:bookmarkEnd w:id="50"/>
+    <w:bookmarkStart w:id="51" w:name="white_check_mark-resumen-en-3-frases-1"/>
     <w:p>
       <w:pPr>
         <w:pStyle w:val="Heading2"/>
@@ -10215,7 +10309,7 @@
       <w:r>
         <w:t xml:space="preserve"> </w:t>
       </w:r>
-      <w:hyperlink r:id="rId34">
+      <w:hyperlink r:id="rId37">
         <w:r>
           <w:rPr>
             <w:rStyle w:val="Hyperlink"/>
@@ -10285,9 +10379,9 @@
         </w:pict>
       </w:r>
     </w:p>
-    <w:bookmarkEnd w:id="45"/>
-    <w:bookmarkEnd w:id="46"/>
-    <w:bookmarkStart w:id="56" w:name="X7969b9c557d3ee182864cec3ae64510117ce22d"/>
+    <w:bookmarkEnd w:id="51"/>
+    <w:bookmarkEnd w:id="52"/>
+    <w:bookmarkStart w:id="65" w:name="X7969b9c557d3ee182864cec3ae64510117ce22d"/>
     <w:p>
       <w:pPr>
         <w:pStyle w:val="Heading1"/>
@@ -10343,7 +10437,7 @@
         </w:pict>
       </w:r>
     </w:p>
-    <w:bookmarkStart w:id="47" w:name="mailbox_with_mail-la-idea-en-una-frase-2"/>
+    <w:bookmarkStart w:id="53" w:name="mailbox_with_mail-la-idea-en-una-frase-2"/>
     <w:p>
       <w:pPr>
         <w:pStyle w:val="Heading2"/>
@@ -10497,8 +10591,8 @@
         </w:pict>
       </w:r>
     </w:p>
-    <w:bookmarkEnd w:id="47"/>
-    <w:bookmarkStart w:id="48" w:name="Xff1d85ffe0d06813b5d5a8f5cb66d3f54c10b6e"/>
+    <w:bookmarkEnd w:id="53"/>
+    <w:bookmarkStart w:id="54" w:name="Xff1d85ffe0d06813b5d5a8f5cb66d3f54c10b6e"/>
     <w:p>
       <w:pPr>
         <w:pStyle w:val="Heading2"/>
@@ -11297,8 +11391,8 @@
         </w:pict>
       </w:r>
     </w:p>
-    <w:bookmarkEnd w:id="48"/>
-    <w:bookmarkStart w:id="49" w:name="warning-la-división-entera-mata"/>
+    <w:bookmarkEnd w:id="54"/>
+    <w:bookmarkStart w:id="58" w:name="warning-la-división-entera-mata"/>
     <w:p>
       <w:pPr>
         <w:pStyle w:val="Heading2"/>
@@ -11619,6 +11713,53 @@
       </w:r>
       <w:r>
         <w:t xml:space="preserve">. Memorízalo como un mantra.</w:t>
+      </w:r>
+    </w:p>
+    <w:p>
+      <w:pPr>
+        <w:pStyle w:val="FirstParagraph"/>
+      </w:pPr>
+      <w:r>
+        <w:drawing>
+          <wp:inline>
+            <wp:extent cx="5334000" cy="2798089"/>
+            <wp:effectExtent b="0" l="0" r="0" t="0"/>
+            <wp:docPr descr="Árbol de la división entera: si ambos operandos son int, 17/5 trunca a 3; si hay un double, 17.0/5 da 3.4" title="" id="56" name="Picture"/>
+            <a:graphic>
+              <a:graphicData uri="http://schemas.openxmlformats.org/drawingml/2006/picture">
+                <pic:pic>
+                  <pic:nvPicPr>
+                    <pic:cNvPr descr="C:/Users/serga/AppData/Local/Temp/opencode/docxgen/png/u03-division-entera-arbol.png" id="57" name="Picture"/>
+                    <pic:cNvPicPr>
+                      <a:picLocks noChangeArrowheads="1" noChangeAspect="1"/>
+                    </pic:cNvPicPr>
+                  </pic:nvPicPr>
+                  <pic:blipFill>
+                    <a:blip r:embed="rId55"/>
+                    <a:stretch>
+                      <a:fillRect/>
+                    </a:stretch>
+                  </pic:blipFill>
+                  <pic:spPr bwMode="auto">
+                    <a:xfrm>
+                      <a:off x="0" y="0"/>
+                      <a:ext cx="5334000" cy="2798089"/>
+                    </a:xfrm>
+                    <a:prstGeom prst="rect">
+                      <a:avLst/>
+                    </a:prstGeom>
+                    <a:noFill/>
+                    <a:ln w="9525">
+                      <a:noFill/>
+                      <a:headEnd/>
+                      <a:tailEnd/>
+                    </a:ln>
+                  </pic:spPr>
+                </pic:pic>
+              </a:graphicData>
+            </a:graphic>
+          </wp:inline>
+        </w:drawing>
       </w:r>
     </w:p>
     <w:p>
@@ -11628,8 +11769,8 @@
         </w:pict>
       </w:r>
     </w:p>
-    <w:bookmarkEnd w:id="49"/>
-    <w:bookmarkStart w:id="50" w:name="Xea5de232d72fb9d78fe7a7a780b996325df6417"/>
+    <w:bookmarkEnd w:id="58"/>
+    <w:bookmarkStart w:id="59" w:name="Xea5de232d72fb9d78fe7a7a780b996325df6417"/>
     <w:p>
       <w:pPr>
         <w:pStyle w:val="Heading2"/>
@@ -12040,8 +12181,8 @@
         </w:pict>
       </w:r>
     </w:p>
-    <w:bookmarkEnd w:id="50"/>
-    <w:bookmarkStart w:id="51" w:name="Xd93a7c925aef647c1b87b99e7fcd14364623b0c"/>
+    <w:bookmarkEnd w:id="59"/>
+    <w:bookmarkStart w:id="60" w:name="Xd93a7c925aef647c1b87b99e7fcd14364623b0c"/>
     <w:p>
       <w:pPr>
         <w:pStyle w:val="Heading2"/>
@@ -12359,8 +12500,8 @@
         </w:pict>
       </w:r>
     </w:p>
-    <w:bookmarkEnd w:id="51"/>
-    <w:bookmarkStart w:id="52" w:name="muscle--y----flexiones-para-variables"/>
+    <w:bookmarkEnd w:id="60"/>
+    <w:bookmarkStart w:id="61" w:name="muscle--y----flexiones-para-variables"/>
     <w:p>
       <w:pPr>
         <w:pStyle w:val="Heading2"/>
@@ -12716,8 +12857,8 @@
         </w:pict>
       </w:r>
     </w:p>
-    <w:bookmarkEnd w:id="52"/>
-    <w:bookmarkStart w:id="53" w:name="star-sé-el-código-my-friend-2"/>
+    <w:bookmarkEnd w:id="61"/>
+    <w:bookmarkStart w:id="62" w:name="star-sé-el-código-my-friend-2"/>
     <w:p>
       <w:pPr>
         <w:pStyle w:val="Heading2"/>
@@ -13223,8 +13364,8 @@
         </w:pict>
       </w:r>
     </w:p>
-    <w:bookmarkEnd w:id="53"/>
-    <w:bookmarkStart w:id="54" w:name="dart-mini-chequeo-2"/>
+    <w:bookmarkEnd w:id="62"/>
+    <w:bookmarkStart w:id="63" w:name="dart-mini-chequeo-2"/>
     <w:p>
       <w:pPr>
         <w:pStyle w:val="Heading2"/>
@@ -13657,8 +13798,8 @@
         </w:pict>
       </w:r>
     </w:p>
-    <w:bookmarkEnd w:id="54"/>
-    <w:bookmarkStart w:id="55" w:name="white_check_mark-resumen-en-3-frases-2"/>
+    <w:bookmarkEnd w:id="63"/>
+    <w:bookmarkStart w:id="64" w:name="white_check_mark-resumen-en-3-frases-2"/>
     <w:p>
       <w:pPr>
         <w:pStyle w:val="Heading2"/>
@@ -14089,7 +14230,7 @@
       <w:r>
         <w:t xml:space="preserve"> </w:t>
       </w:r>
-      <w:hyperlink r:id="rId34">
+      <w:hyperlink r:id="rId37">
         <w:r>
           <w:rPr>
             <w:rStyle w:val="Hyperlink"/>
@@ -14159,9 +14300,9 @@
         </w:pict>
       </w:r>
     </w:p>
-    <w:bookmarkEnd w:id="55"/>
-    <w:bookmarkEnd w:id="56"/>
-    <w:bookmarkStart w:id="66" w:name="X2a069960f80c1e08f6f8f13cd179ce3de6fcd30"/>
+    <w:bookmarkEnd w:id="64"/>
+    <w:bookmarkEnd w:id="65"/>
+    <w:bookmarkStart w:id="78" w:name="X2a069960f80c1e08f6f8f13cd179ce3de6fcd30"/>
     <w:p>
       <w:pPr>
         <w:pStyle w:val="Heading1"/>
@@ -14217,7 +14358,7 @@
         </w:pict>
       </w:r>
     </w:p>
-    <w:bookmarkStart w:id="57" w:name="mailbox_with_mail-la-idea-en-una-frase-3"/>
+    <w:bookmarkStart w:id="66" w:name="mailbox_with_mail-la-idea-en-una-frase-3"/>
     <w:p>
       <w:pPr>
         <w:pStyle w:val="Heading2"/>
@@ -14487,8 +14628,8 @@
         </w:pict>
       </w:r>
     </w:p>
-    <w:bookmarkEnd w:id="57"/>
-    <w:bookmarkStart w:id="58" w:name="X883cc7fe3a4d0a2eb0cf850a49fb75eea7cf224"/>
+    <w:bookmarkEnd w:id="66"/>
+    <w:bookmarkStart w:id="67" w:name="X883cc7fe3a4d0a2eb0cf850a49fb75eea7cf224"/>
     <w:p>
       <w:pPr>
         <w:pStyle w:val="Heading2"/>
@@ -15307,8 +15448,8 @@
         </w:pict>
       </w:r>
     </w:p>
-    <w:bookmarkEnd w:id="58"/>
-    <w:bookmarkStart w:id="59" w:name="door-lógicos-el-portero-del-club"/>
+    <w:bookmarkEnd w:id="67"/>
+    <w:bookmarkStart w:id="68" w:name="door-lógicos-el-portero-del-club"/>
     <w:p>
       <w:pPr>
         <w:pStyle w:val="Heading2"/>
@@ -15790,8 +15931,8 @@
         </w:pict>
       </w:r>
     </w:p>
-    <w:bookmarkEnd w:id="59"/>
-    <w:bookmarkStart w:id="60" w:name="zap-cortocircuito-el-portero-que-no-mira"/>
+    <w:bookmarkEnd w:id="68"/>
+    <w:bookmarkStart w:id="72" w:name="zap-cortocircuito-el-portero-que-no-mira"/>
     <w:p>
       <w:pPr>
         <w:pStyle w:val="Heading2"/>
@@ -16233,14 +16374,61 @@
       </w:r>
     </w:p>
     <w:p>
+      <w:pPr>
+        <w:pStyle w:val="FirstParagraph"/>
+      </w:pPr>
+      <w:r>
+        <w:drawing>
+          <wp:inline>
+            <wp:extent cx="5334000" cy="2709110"/>
+            <wp:effectExtent b="0" l="0" r="0" t="0"/>
+            <wp:docPr descr="Flujo de cortocircuito: con &amp;&amp; si la 1ª condición es false y con || si es true, la 2ª condición no se evalúa (¡STOP!)" title="" id="70" name="Picture"/>
+            <a:graphic>
+              <a:graphicData uri="http://schemas.openxmlformats.org/drawingml/2006/picture">
+                <pic:pic>
+                  <pic:nvPicPr>
+                    <pic:cNvPr descr="C:/Users/serga/AppData/Local/Temp/opencode/docxgen/png/u03-cortocircuito-flujo.png" id="71" name="Picture"/>
+                    <pic:cNvPicPr>
+                      <a:picLocks noChangeArrowheads="1" noChangeAspect="1"/>
+                    </pic:cNvPicPr>
+                  </pic:nvPicPr>
+                  <pic:blipFill>
+                    <a:blip r:embed="rId69"/>
+                    <a:stretch>
+                      <a:fillRect/>
+                    </a:stretch>
+                  </pic:blipFill>
+                  <pic:spPr bwMode="auto">
+                    <a:xfrm>
+                      <a:off x="0" y="0"/>
+                      <a:ext cx="5334000" cy="2709110"/>
+                    </a:xfrm>
+                    <a:prstGeom prst="rect">
+                      <a:avLst/>
+                    </a:prstGeom>
+                    <a:noFill/>
+                    <a:ln w="9525">
+                      <a:noFill/>
+                      <a:headEnd/>
+                      <a:tailEnd/>
+                    </a:ln>
+                  </pic:spPr>
+                </pic:pic>
+              </a:graphicData>
+            </a:graphic>
+          </wp:inline>
+        </w:drawing>
+      </w:r>
+    </w:p>
+    <w:p>
       <w:r>
         <w:pict>
           <v:rect style="width:0;height:1.5pt" o:hralign="center" o:hrstd="t" o:hr="t"/>
         </w:pict>
       </w:r>
     </w:p>
-    <w:bookmarkEnd w:id="60"/>
-    <w:bookmarkStart w:id="61" w:name="X9dbcc5b314c3383e2b3cdc99c00aeddd01c1fbc"/>
+    <w:bookmarkEnd w:id="72"/>
+    <w:bookmarkStart w:id="73" w:name="X9dbcc5b314c3383e2b3cdc99c00aeddd01c1fbc"/>
     <w:p>
       <w:pPr>
         <w:pStyle w:val="Heading2"/>
@@ -16628,8 +16816,8 @@
         </w:pict>
       </w:r>
     </w:p>
-    <w:bookmarkEnd w:id="61"/>
-    <w:bookmarkStart w:id="62" w:name="X4a38ff0f91b43be716f5f7f880427b7400213db"/>
+    <w:bookmarkEnd w:id="73"/>
+    <w:bookmarkStart w:id="74" w:name="X4a38ff0f91b43be716f5f7f880427b7400213db"/>
     <w:p>
       <w:pPr>
         <w:pStyle w:val="Heading2"/>
@@ -17565,8 +17753,8 @@
         </w:pict>
       </w:r>
     </w:p>
-    <w:bookmarkEnd w:id="62"/>
-    <w:bookmarkStart w:id="63" w:name="star-sé-el-código-my-friend-3"/>
+    <w:bookmarkEnd w:id="74"/>
+    <w:bookmarkStart w:id="75" w:name="star-sé-el-código-my-friend-3"/>
     <w:p>
       <w:pPr>
         <w:pStyle w:val="Heading2"/>
@@ -18755,8 +18943,8 @@
         </w:pict>
       </w:r>
     </w:p>
-    <w:bookmarkEnd w:id="63"/>
-    <w:bookmarkStart w:id="64" w:name="dart-mini-chequeo-3"/>
+    <w:bookmarkEnd w:id="75"/>
+    <w:bookmarkStart w:id="76" w:name="dart-mini-chequeo-3"/>
     <w:p>
       <w:pPr>
         <w:pStyle w:val="Heading2"/>
@@ -19104,8 +19292,8 @@
         </w:pict>
       </w:r>
     </w:p>
-    <w:bookmarkEnd w:id="64"/>
-    <w:bookmarkStart w:id="65" w:name="white_check_mark-resumen-en-3-frases-3"/>
+    <w:bookmarkEnd w:id="76"/>
+    <w:bookmarkStart w:id="77" w:name="white_check_mark-resumen-en-3-frases-3"/>
     <w:p>
       <w:pPr>
         <w:pStyle w:val="Heading2"/>
@@ -19616,7 +19804,7 @@
       <w:r>
         <w:t xml:space="preserve"> </w:t>
       </w:r>
-      <w:hyperlink r:id="rId34">
+      <w:hyperlink r:id="rId37">
         <w:r>
           <w:rPr>
             <w:rStyle w:val="Hyperlink"/>
@@ -19686,9 +19874,9 @@
         </w:pict>
       </w:r>
     </w:p>
-    <w:bookmarkEnd w:id="65"/>
-    <w:bookmarkEnd w:id="66"/>
-    <w:bookmarkStart w:id="76" w:name="X75487b4bf2659c67a6593232a7e2faee4084eae"/>
+    <w:bookmarkEnd w:id="77"/>
+    <w:bookmarkEnd w:id="78"/>
+    <w:bookmarkStart w:id="91" w:name="X75487b4bf2659c67a6593232a7e2faee4084eae"/>
     <w:p>
       <w:pPr>
         <w:pStyle w:val="Heading1"/>
@@ -19744,7 +19932,7 @@
         </w:pict>
       </w:r>
     </w:p>
-    <w:bookmarkStart w:id="67" w:name="mailbox_with_mail-la-idea-en-una-frase-4"/>
+    <w:bookmarkStart w:id="79" w:name="mailbox_with_mail-la-idea-en-una-frase-4"/>
     <w:p>
       <w:pPr>
         <w:pStyle w:val="Heading2"/>
@@ -19809,8 +19997,8 @@
         </w:pict>
       </w:r>
     </w:p>
-    <w:bookmarkEnd w:id="67"/>
-    <w:bookmarkStart w:id="68" w:name="Xeeb48ae3d64399839c0d4c5088d947a3c69df11"/>
+    <w:bookmarkEnd w:id="79"/>
+    <w:bookmarkStart w:id="83" w:name="Xeeb48ae3d64399839c0d4c5088d947a3c69df11"/>
     <w:p>
       <w:pPr>
         <w:pStyle w:val="Heading2"/>
@@ -20012,6 +20200,53 @@
       </w:pPr>
       <w:r>
         <w:t xml:space="preserve">Cualquier tipo puede pasar al que está a su derecha sin que se pierda ni un bit. Java sonríe y te deja.</w:t>
+      </w:r>
+    </w:p>
+    <w:p>
+      <w:pPr>
+        <w:pStyle w:val="BodyText"/>
+      </w:pPr>
+      <w:r>
+        <w:drawing>
+          <wp:inline>
+            <wp:extent cx="5334000" cy="1421042"/>
+            <wp:effectExtent b="0" l="0" r="0" t="0"/>
+            <wp:docPr descr="Escalera de casting: de byte a double con flechas verdes de conversión implícita y flecha roja de vuelta con casting explícito (narrowing)" title="" id="81" name="Picture"/>
+            <a:graphic>
+              <a:graphicData uri="http://schemas.openxmlformats.org/drawingml/2006/picture">
+                <pic:pic>
+                  <pic:nvPicPr>
+                    <pic:cNvPr descr="C:/Users/serga/AppData/Local/Temp/opencode/docxgen/png/u03-escalera-casting.png" id="82" name="Picture"/>
+                    <pic:cNvPicPr>
+                      <a:picLocks noChangeArrowheads="1" noChangeAspect="1"/>
+                    </pic:cNvPicPr>
+                  </pic:nvPicPr>
+                  <pic:blipFill>
+                    <a:blip r:embed="rId80"/>
+                    <a:stretch>
+                      <a:fillRect/>
+                    </a:stretch>
+                  </pic:blipFill>
+                  <pic:spPr bwMode="auto">
+                    <a:xfrm>
+                      <a:off x="0" y="0"/>
+                      <a:ext cx="5334000" cy="1421042"/>
+                    </a:xfrm>
+                    <a:prstGeom prst="rect">
+                      <a:avLst/>
+                    </a:prstGeom>
+                    <a:noFill/>
+                    <a:ln w="9525">
+                      <a:noFill/>
+                      <a:headEnd/>
+                      <a:tailEnd/>
+                    </a:ln>
+                  </pic:spPr>
+                </pic:pic>
+              </a:graphicData>
+            </a:graphic>
+          </wp:inline>
+        </w:drawing>
       </w:r>
     </w:p>
     <w:p>
@@ -20021,8 +20256,8 @@
         </w:pict>
       </w:r>
     </w:p>
-    <w:bookmarkEnd w:id="68"/>
-    <w:bookmarkStart w:id="69" w:name="Xe67c63c0a7eb24b9b7aba6d3046f36e72356905"/>
+    <w:bookmarkEnd w:id="83"/>
+    <w:bookmarkStart w:id="84" w:name="Xe67c63c0a7eb24b9b7aba6d3046f36e72356905"/>
     <w:p>
       <w:pPr>
         <w:pStyle w:val="Heading2"/>
@@ -20404,8 +20639,8 @@
         </w:pict>
       </w:r>
     </w:p>
-    <w:bookmarkEnd w:id="69"/>
-    <w:bookmarkStart w:id="70" w:name="axe-el-truncamiento-el-céntimo-olvidado"/>
+    <w:bookmarkEnd w:id="84"/>
+    <w:bookmarkStart w:id="85" w:name="axe-el-truncamiento-el-céntimo-olvidado"/>
     <w:p>
       <w:pPr>
         <w:pStyle w:val="Heading2"/>
@@ -20667,8 +20902,8 @@
         </w:pict>
       </w:r>
     </w:p>
-    <w:bookmarkEnd w:id="70"/>
-    <w:bookmarkStart w:id="71" w:name="Xa1463eb82a2eb72c4fd445b5e25bf7a521a1c22"/>
+    <w:bookmarkEnd w:id="85"/>
+    <w:bookmarkStart w:id="86" w:name="Xa1463eb82a2eb72c4fd445b5e25bf7a521a1c22"/>
     <w:p>
       <w:pPr>
         <w:pStyle w:val="Heading2"/>
@@ -20924,8 +21159,8 @@
         </w:pict>
       </w:r>
     </w:p>
-    <w:bookmarkEnd w:id="71"/>
-    <w:bookmarkStart w:id="72" w:name="Xe5a08c35e656a6be005b54b4af71442697c7ac9"/>
+    <w:bookmarkEnd w:id="86"/>
+    <w:bookmarkStart w:id="87" w:name="Xe5a08c35e656a6be005b54b4af71442697c7ac9"/>
     <w:p>
       <w:pPr>
         <w:pStyle w:val="Heading2"/>
@@ -22095,8 +22330,8 @@
         </w:pict>
       </w:r>
     </w:p>
-    <w:bookmarkEnd w:id="72"/>
-    <w:bookmarkStart w:id="73" w:name="star-sé-el-código-my-friend-4"/>
+    <w:bookmarkEnd w:id="87"/>
+    <w:bookmarkStart w:id="88" w:name="star-sé-el-código-my-friend-4"/>
     <w:p>
       <w:pPr>
         <w:pStyle w:val="Heading2"/>
@@ -22729,8 +22964,8 @@
         </w:pict>
       </w:r>
     </w:p>
-    <w:bookmarkEnd w:id="73"/>
-    <w:bookmarkStart w:id="74" w:name="dart-mini-chequeo-4"/>
+    <w:bookmarkEnd w:id="88"/>
+    <w:bookmarkStart w:id="89" w:name="dart-mini-chequeo-4"/>
     <w:p>
       <w:pPr>
         <w:pStyle w:val="Heading2"/>
@@ -23152,8 +23387,8 @@
         </w:pict>
       </w:r>
     </w:p>
-    <w:bookmarkEnd w:id="74"/>
-    <w:bookmarkStart w:id="75" w:name="white_check_mark-resumen-en-3-frases-4"/>
+    <w:bookmarkEnd w:id="89"/>
+    <w:bookmarkStart w:id="90" w:name="white_check_mark-resumen-en-3-frases-4"/>
     <w:p>
       <w:pPr>
         <w:pStyle w:val="Heading2"/>
@@ -23505,7 +23740,7 @@
       <w:r>
         <w:t xml:space="preserve"> </w:t>
       </w:r>
-      <w:hyperlink r:id="rId34">
+      <w:hyperlink r:id="rId37">
         <w:r>
           <w:rPr>
             <w:rStyle w:val="Hyperlink"/>
@@ -23575,9 +23810,9 @@
         </w:pict>
       </w:r>
     </w:p>
-    <w:bookmarkEnd w:id="75"/>
-    <w:bookmarkEnd w:id="76"/>
-    <w:bookmarkStart w:id="86" w:name="Xc23eae5433bce307fddeb9af1d8711236d9dc14"/>
+    <w:bookmarkEnd w:id="90"/>
+    <w:bookmarkEnd w:id="91"/>
+    <w:bookmarkStart w:id="104" w:name="Xc23eae5433bce307fddeb9af1d8711236d9dc14"/>
     <w:p>
       <w:pPr>
         <w:pStyle w:val="Heading1"/>
@@ -23633,7 +23868,7 @@
         </w:pict>
       </w:r>
     </w:p>
-    <w:bookmarkStart w:id="77" w:name="mailbox_with_mail-la-idea-en-una-frase-5"/>
+    <w:bookmarkStart w:id="92" w:name="mailbox_with_mail-la-idea-en-una-frase-5"/>
     <w:p>
       <w:pPr>
         <w:pStyle w:val="Heading2"/>
@@ -23786,8 +24021,8 @@
         </w:pict>
       </w:r>
     </w:p>
-    <w:bookmarkEnd w:id="77"/>
-    <w:bookmarkStart w:id="78" w:name="Xd304258fc107c2e533514c9072a910b1c57c9b1"/>
+    <w:bookmarkEnd w:id="92"/>
+    <w:bookmarkStart w:id="93" w:name="Xd304258fc107c2e533514c9072a910b1c57c9b1"/>
     <w:p>
       <w:pPr>
         <w:pStyle w:val="Heading2"/>
@@ -23914,8 +24149,8 @@
         </w:pict>
       </w:r>
     </w:p>
-    <w:bookmarkEnd w:id="78"/>
-    <w:bookmarkStart w:id="79" w:name="X9704585d059dc08827be07306d12f67cd1ca53c"/>
+    <w:bookmarkEnd w:id="93"/>
+    <w:bookmarkStart w:id="94" w:name="X9704585d059dc08827be07306d12f67cd1ca53c"/>
     <w:p>
       <w:pPr>
         <w:pStyle w:val="Heading2"/>
@@ -24228,8 +24463,8 @@
         </w:pict>
       </w:r>
     </w:p>
-    <w:bookmarkEnd w:id="79"/>
-    <w:bookmarkStart w:id="80" w:name="Xbfc716715dadbecada1567cce47e1f5c15e891b"/>
+    <w:bookmarkEnd w:id="94"/>
+    <w:bookmarkStart w:id="95" w:name="Xbfc716715dadbecada1567cce47e1f5c15e891b"/>
     <w:p>
       <w:pPr>
         <w:pStyle w:val="Heading2"/>
@@ -25446,8 +25681,8 @@
         </w:pict>
       </w:r>
     </w:p>
-    <w:bookmarkEnd w:id="80"/>
-    <w:bookmarkStart w:id="81" w:name="warning-el-lío-de-nextline-tras-nextint"/>
+    <w:bookmarkEnd w:id="95"/>
+    <w:bookmarkStart w:id="99" w:name="warning-el-lío-de-nextline-tras-nextint"/>
     <w:p>
       <w:pPr>
         <w:pStyle w:val="Heading2"/>
@@ -26164,6 +26399,53 @@
       </w:r>
       <w:r>
         <w:t xml:space="preserve">Es el guardián del buffer.</w:t>
+      </w:r>
+    </w:p>
+    <w:p>
+      <w:pPr>
+        <w:pStyle w:val="FirstParagraph"/>
+      </w:pPr>
+      <w:r>
+        <w:drawing>
+          <wp:inline>
+            <wp:extent cx="5334000" cy="2963811"/>
+            <wp:effectExtent b="0" l="0" r="0" t="0"/>
+            <wp:docPr descr="Comparación de carriles tras nextInt(): el carril malo se traga el Enter y devuelve cadena vacía, el carril bueno añade un nextLine() vacío y lee el nombre" title="" id="97" name="Picture"/>
+            <a:graphic>
+              <a:graphicData uri="http://schemas.openxmlformats.org/drawingml/2006/picture">
+                <pic:pic>
+                  <pic:nvPicPr>
+                    <pic:cNvPr descr="C:/Users/serga/AppData/Local/Temp/opencode/docxgen/png/u03-buffer-enter-residual.png" id="98" name="Picture"/>
+                    <pic:cNvPicPr>
+                      <a:picLocks noChangeArrowheads="1" noChangeAspect="1"/>
+                    </pic:cNvPicPr>
+                  </pic:nvPicPr>
+                  <pic:blipFill>
+                    <a:blip r:embed="rId96"/>
+                    <a:stretch>
+                      <a:fillRect/>
+                    </a:stretch>
+                  </pic:blipFill>
+                  <pic:spPr bwMode="auto">
+                    <a:xfrm>
+                      <a:off x="0" y="0"/>
+                      <a:ext cx="5334000" cy="2963811"/>
+                    </a:xfrm>
+                    <a:prstGeom prst="rect">
+                      <a:avLst/>
+                    </a:prstGeom>
+                    <a:noFill/>
+                    <a:ln w="9525">
+                      <a:noFill/>
+                      <a:headEnd/>
+                      <a:tailEnd/>
+                    </a:ln>
+                  </pic:spPr>
+                </pic:pic>
+              </a:graphicData>
+            </a:graphic>
+          </wp:inline>
+        </w:drawing>
       </w:r>
     </w:p>
     <w:p>
@@ -26173,8 +26455,8 @@
         </w:pict>
       </w:r>
     </w:p>
-    <w:bookmarkEnd w:id="81"/>
-    <w:bookmarkStart w:id="82" w:name="X21c236785dd7f07914c13d149f72c73cf5eca74"/>
+    <w:bookmarkEnd w:id="99"/>
+    <w:bookmarkStart w:id="100" w:name="X21c236785dd7f07914c13d149f72c73cf5eca74"/>
     <w:p>
       <w:pPr>
         <w:pStyle w:val="Heading2"/>
@@ -27095,8 +27377,8 @@
         </w:pict>
       </w:r>
     </w:p>
-    <w:bookmarkEnd w:id="82"/>
-    <w:bookmarkStart w:id="83" w:name="star-sé-el-código-my-friend-5"/>
+    <w:bookmarkEnd w:id="100"/>
+    <w:bookmarkStart w:id="101" w:name="star-sé-el-código-my-friend-5"/>
     <w:p>
       <w:pPr>
         <w:pStyle w:val="Heading2"/>
@@ -27822,8 +28104,8 @@
         </w:pict>
       </w:r>
     </w:p>
-    <w:bookmarkEnd w:id="83"/>
-    <w:bookmarkStart w:id="84" w:name="dart-mini-chequeo-5"/>
+    <w:bookmarkEnd w:id="101"/>
+    <w:bookmarkStart w:id="102" w:name="dart-mini-chequeo-5"/>
     <w:p>
       <w:pPr>
         <w:pStyle w:val="Heading2"/>
@@ -28175,8 +28457,8 @@
         </w:pict>
       </w:r>
     </w:p>
-    <w:bookmarkEnd w:id="84"/>
-    <w:bookmarkStart w:id="85" w:name="white_check_mark-resumen-en-3-frases-5"/>
+    <w:bookmarkEnd w:id="102"/>
+    <w:bookmarkStart w:id="103" w:name="white_check_mark-resumen-en-3-frases-5"/>
     <w:p>
       <w:pPr>
         <w:pStyle w:val="Heading2"/>
@@ -28593,7 +28875,7 @@
       <w:r>
         <w:t xml:space="preserve"> </w:t>
       </w:r>
-      <w:hyperlink r:id="rId34">
+      <w:hyperlink r:id="rId37">
         <w:r>
           <w:rPr>
             <w:rStyle w:val="Hyperlink"/>
@@ -28663,9 +28945,9 @@
         </w:pict>
       </w:r>
     </w:p>
-    <w:bookmarkEnd w:id="85"/>
-    <w:bookmarkEnd w:id="86"/>
-    <w:bookmarkStart w:id="101" w:name="Xe6ef48a7b2d281b434cb6baaaf0d693116de06f"/>
+    <w:bookmarkEnd w:id="103"/>
+    <w:bookmarkEnd w:id="104"/>
+    <w:bookmarkStart w:id="122" w:name="Xe6ef48a7b2d281b434cb6baaaf0d693116de06f"/>
     <w:p>
       <w:pPr>
         <w:pStyle w:val="Heading1"/>
@@ -28721,7 +29003,7 @@
         </w:pict>
       </w:r>
     </w:p>
-    <w:bookmarkStart w:id="87" w:name="mailbox_with_mail-la-idea-en-una-frase-6"/>
+    <w:bookmarkStart w:id="105" w:name="mailbox_with_mail-la-idea-en-una-frase-6"/>
     <w:p>
       <w:pPr>
         <w:pStyle w:val="Heading2"/>
@@ -28830,8 +29112,8 @@
         </w:pict>
       </w:r>
     </w:p>
-    <w:bookmarkEnd w:id="87"/>
-    <w:bookmarkStart w:id="89" w:name="X0e5f6864473f4d7cd01d89e762f0fdefe57da39"/>
+    <w:bookmarkEnd w:id="105"/>
+    <w:bookmarkStart w:id="110" w:name="X0e5f6864473f4d7cd01d89e762f0fdefe57da39"/>
     <w:p>
       <w:pPr>
         <w:pStyle w:val="Heading2"/>
@@ -29633,7 +29915,54 @@
         <w:t xml:space="preserve">es la opción "oficial".</w:t>
       </w:r>
     </w:p>
-    <w:bookmarkStart w:id="88" w:name="controlar-los-decimales-y-el-ancho"/>
+    <w:p>
+      <w:pPr>
+        <w:pStyle w:val="FirstParagraph"/>
+      </w:pPr>
+      <w:r>
+        <w:drawing>
+          <wp:inline>
+            <wp:extent cx="5334000" cy="1531504"/>
+            <wp:effectExtent b="0" l="0" r="0" t="0"/>
+            <wp:docPr descr="Flujo de printf: la plantilla con huecos %d y %s y los argumentos 25 y Ana pasan por la llamada hasta la salida formateada" title="" id="107" name="Picture"/>
+            <a:graphic>
+              <a:graphicData uri="http://schemas.openxmlformats.org/drawingml/2006/picture">
+                <pic:pic>
+                  <pic:nvPicPr>
+                    <pic:cNvPr descr="C:/Users/serga/AppData/Local/Temp/opencode/docxgen/png/u03-flujo-printf.png" id="108" name="Picture"/>
+                    <pic:cNvPicPr>
+                      <a:picLocks noChangeArrowheads="1" noChangeAspect="1"/>
+                    </pic:cNvPicPr>
+                  </pic:nvPicPr>
+                  <pic:blipFill>
+                    <a:blip r:embed="rId106"/>
+                    <a:stretch>
+                      <a:fillRect/>
+                    </a:stretch>
+                  </pic:blipFill>
+                  <pic:spPr bwMode="auto">
+                    <a:xfrm>
+                      <a:off x="0" y="0"/>
+                      <a:ext cx="5334000" cy="1531504"/>
+                    </a:xfrm>
+                    <a:prstGeom prst="rect">
+                      <a:avLst/>
+                    </a:prstGeom>
+                    <a:noFill/>
+                    <a:ln w="9525">
+                      <a:noFill/>
+                      <a:headEnd/>
+                      <a:tailEnd/>
+                    </a:ln>
+                  </pic:spPr>
+                </pic:pic>
+              </a:graphicData>
+            </a:graphic>
+          </wp:inline>
+        </w:drawing>
+      </w:r>
+    </w:p>
+    <w:bookmarkStart w:id="109" w:name="controlar-los-decimales-y-el-ancho"/>
     <w:p>
       <w:pPr>
         <w:pStyle w:val="Heading3"/>
@@ -30213,9 +30542,9 @@
         </w:pict>
       </w:r>
     </w:p>
-    <w:bookmarkEnd w:id="88"/>
-    <w:bookmarkEnd w:id="89"/>
-    <w:bookmarkStart w:id="90" w:name="X969e009a0d6aaec0494f25b02d3dd8a91688e76"/>
+    <w:bookmarkEnd w:id="109"/>
+    <w:bookmarkEnd w:id="110"/>
+    <w:bookmarkStart w:id="111" w:name="X969e009a0d6aaec0494f25b02d3dd8a91688e76"/>
     <w:p>
       <w:pPr>
         <w:pStyle w:val="Heading2"/>
@@ -30565,8 +30894,8 @@
         </w:pict>
       </w:r>
     </w:p>
-    <w:bookmarkEnd w:id="90"/>
-    <w:bookmarkStart w:id="91" w:name="euro-números-grandes-numberformat"/>
+    <w:bookmarkEnd w:id="111"/>
+    <w:bookmarkStart w:id="112" w:name="euro-números-grandes-numberformat"/>
     <w:p>
       <w:pPr>
         <w:pStyle w:val="Heading2"/>
@@ -31204,8 +31533,8 @@
         </w:pict>
       </w:r>
     </w:p>
-    <w:bookmarkEnd w:id="91"/>
-    <w:bookmarkStart w:id="96" w:name="Xd8bbc6b77e9589c8b4fc73200349e70d85daefd"/>
+    <w:bookmarkEnd w:id="112"/>
+    <w:bookmarkStart w:id="117" w:name="Xd8bbc6b77e9589c8b4fc73200349e70d85daefd"/>
     <w:p>
       <w:pPr>
         <w:pStyle w:val="Heading2"/>
@@ -31237,7 +31566,7 @@
         <w:t xml:space="preserve">es traicionero. Estos son los fallos que se repiten en cada examen y en cada programa de prácticas:</w:t>
       </w:r>
     </w:p>
-    <w:bookmarkStart w:id="92" w:name="X9d2a56caca7eb18e28d853fd396427af15a7436"/>
+    <w:bookmarkStart w:id="113" w:name="X9d2a56caca7eb18e28d853fd396427af15a7436"/>
     <w:p>
       <w:pPr>
         <w:pStyle w:val="Heading3"/>
@@ -31263,8 +31592,8 @@
         <w:t xml:space="preserve">Sin la línea de import, Java no conoce la clase y te lanza un error de compilación. Es el fallo más tonto y el más común.</w:t>
       </w:r>
     </w:p>
-    <w:bookmarkEnd w:id="92"/>
-    <w:bookmarkStart w:id="93" w:name="Xb5c3d8960c9c0a8447dacdb7223c2301818b60d"/>
+    <w:bookmarkEnd w:id="113"/>
+    <w:bookmarkStart w:id="114" w:name="Xb5c3d8960c9c0a8447dacdb7223c2301818b60d"/>
     <w:p>
       <w:pPr>
         <w:pStyle w:val="Heading3"/>
@@ -31418,8 +31747,8 @@
         <w:t xml:space="preserve">();</w:t>
       </w:r>
     </w:p>
-    <w:bookmarkEnd w:id="93"/>
-    <w:bookmarkStart w:id="94" w:name="X5367a587bea64fee8b8844d14a02d34d9ac509a"/>
+    <w:bookmarkEnd w:id="114"/>
+    <w:bookmarkStart w:id="115" w:name="X5367a587bea64fee8b8844d14a02d34d9ac509a"/>
     <w:p>
       <w:pPr>
         <w:pStyle w:val="Heading3"/>
@@ -31916,8 +32245,8 @@
         <w:t xml:space="preserve">antes de volver a preguntar, o se quedará ahí para siempre.</w:t>
       </w:r>
     </w:p>
-    <w:bookmarkEnd w:id="94"/>
-    <w:bookmarkStart w:id="95" w:name="X95f29397a9e1cd59e089d7c26e1d48264b4a627"/>
+    <w:bookmarkEnd w:id="115"/>
+    <w:bookmarkStart w:id="116" w:name="X95f29397a9e1cd59e089d7c26e1d48264b4a627"/>
     <w:p>
       <w:pPr>
         <w:pStyle w:val="Heading3"/>
@@ -31986,9 +32315,9 @@
         </w:pict>
       </w:r>
     </w:p>
-    <w:bookmarkEnd w:id="95"/>
-    <w:bookmarkEnd w:id="96"/>
-    <w:bookmarkStart w:id="97" w:name="Xe7fd13cc40002d50f9f8ad2f68d58227e46defb"/>
+    <w:bookmarkEnd w:id="116"/>
+    <w:bookmarkEnd w:id="117"/>
+    <w:bookmarkStart w:id="118" w:name="Xe7fd13cc40002d50f9f8ad2f68d58227e46defb"/>
     <w:p>
       <w:pPr>
         <w:pStyle w:val="Heading2"/>
@@ -32929,8 +33258,8 @@
         </w:pict>
       </w:r>
     </w:p>
-    <w:bookmarkEnd w:id="97"/>
-    <w:bookmarkStart w:id="98" w:name="star-sé-el-código-my-friend-6"/>
+    <w:bookmarkEnd w:id="118"/>
+    <w:bookmarkStart w:id="119" w:name="star-sé-el-código-my-friend-6"/>
     <w:p>
       <w:pPr>
         <w:pStyle w:val="Heading2"/>
@@ -33583,8 +33912,8 @@
         </w:pict>
       </w:r>
     </w:p>
-    <w:bookmarkEnd w:id="98"/>
-    <w:bookmarkStart w:id="99" w:name="dart-mini-chequeo-6"/>
+    <w:bookmarkEnd w:id="119"/>
+    <w:bookmarkStart w:id="120" w:name="dart-mini-chequeo-6"/>
     <w:p>
       <w:pPr>
         <w:pStyle w:val="Heading2"/>
@@ -33862,8 +34191,8 @@
         </w:pict>
       </w:r>
     </w:p>
-    <w:bookmarkEnd w:id="99"/>
-    <w:bookmarkStart w:id="100" w:name="white_check_mark-resumen-en-3-frases-6"/>
+    <w:bookmarkEnd w:id="120"/>
+    <w:bookmarkStart w:id="121" w:name="white_check_mark-resumen-en-3-frases-6"/>
     <w:p>
       <w:pPr>
         <w:pStyle w:val="Heading2"/>
@@ -34324,7 +34653,7 @@
       <w:r>
         <w:t xml:space="preserve"> </w:t>
       </w:r>
-      <w:hyperlink r:id="rId34">
+      <w:hyperlink r:id="rId37">
         <w:r>
           <w:rPr>
             <w:rStyle w:val="Hyperlink"/>
@@ -34394,9 +34723,9 @@
         </w:pict>
       </w:r>
     </w:p>
-    <w:bookmarkEnd w:id="100"/>
-    <w:bookmarkEnd w:id="101"/>
-    <w:bookmarkStart w:id="110" w:name="Xe6fade3ee088c5bcc64aa03e1f15c8653604f03"/>
+    <w:bookmarkEnd w:id="121"/>
+    <w:bookmarkEnd w:id="122"/>
+    <w:bookmarkStart w:id="134" w:name="Xe6fade3ee088c5bcc64aa03e1f15c8653604f03"/>
     <w:p>
       <w:pPr>
         <w:pStyle w:val="Heading1"/>
@@ -34452,7 +34781,7 @@
         </w:pict>
       </w:r>
     </w:p>
-    <w:bookmarkStart w:id="102" w:name="mailbox_with_mail-la-idea-en-una-frase-7"/>
+    <w:bookmarkStart w:id="123" w:name="mailbox_with_mail-la-idea-en-una-frase-7"/>
     <w:p>
       <w:pPr>
         <w:pStyle w:val="Heading2"/>
@@ -34602,8 +34931,8 @@
         </w:pict>
       </w:r>
     </w:p>
-    <w:bookmarkEnd w:id="102"/>
-    <w:bookmarkStart w:id="103" w:name="X7d8e4173009a484df5feda06606687b86b22f50"/>
+    <w:bookmarkEnd w:id="123"/>
+    <w:bookmarkStart w:id="124" w:name="X7d8e4173009a484df5feda06606687b86b22f50"/>
     <w:p>
       <w:pPr>
         <w:pStyle w:val="Heading2"/>
@@ -34937,8 +35266,8 @@
         </w:pict>
       </w:r>
     </w:p>
-    <w:bookmarkEnd w:id="103"/>
-    <w:bookmarkStart w:id="104" w:name="X6658b2b21494e4937e29ff930024f848189be07"/>
+    <w:bookmarkEnd w:id="124"/>
+    <w:bookmarkStart w:id="128" w:name="X6658b2b21494e4937e29ff930024f848189be07"/>
     <w:p>
       <w:pPr>
         <w:pStyle w:val="Heading2"/>
@@ -35884,14 +36213,61 @@
       </w:r>
     </w:p>
     <w:p>
+      <w:pPr>
+        <w:pStyle w:val="FirstParagraph"/>
+      </w:pPr>
+      <w:r>
+        <w:drawing>
+          <wp:inline>
+            <wp:extent cx="5334000" cy="1819348"/>
+            <wp:effectExtent b="0" l="0" r="0" t="0"/>
+            <wp:docPr descr="Escalera de la fórmula aleatoria: de Math.random() entre 0 y 0,999 al rango 1-6 tras multiplicar, truncar con int y sumar, con la fórmula universal debajo" title="" id="126" name="Picture"/>
+            <a:graphic>
+              <a:graphicData uri="http://schemas.openxmlformats.org/drawingml/2006/picture">
+                <pic:pic>
+                  <pic:nvPicPr>
+                    <pic:cNvPr descr="C:/Users/serga/AppData/Local/Temp/opencode/docxgen/png/u03-escalera-random.png" id="127" name="Picture"/>
+                    <pic:cNvPicPr>
+                      <a:picLocks noChangeArrowheads="1" noChangeAspect="1"/>
+                    </pic:cNvPicPr>
+                  </pic:nvPicPr>
+                  <pic:blipFill>
+                    <a:blip r:embed="rId125"/>
+                    <a:stretch>
+                      <a:fillRect/>
+                    </a:stretch>
+                  </pic:blipFill>
+                  <pic:spPr bwMode="auto">
+                    <a:xfrm>
+                      <a:off x="0" y="0"/>
+                      <a:ext cx="5334000" cy="1819348"/>
+                    </a:xfrm>
+                    <a:prstGeom prst="rect">
+                      <a:avLst/>
+                    </a:prstGeom>
+                    <a:noFill/>
+                    <a:ln w="9525">
+                      <a:noFill/>
+                      <a:headEnd/>
+                      <a:tailEnd/>
+                    </a:ln>
+                  </pic:spPr>
+                </pic:pic>
+              </a:graphicData>
+            </a:graphic>
+          </wp:inline>
+        </w:drawing>
+      </w:r>
+    </w:p>
+    <w:p>
       <w:r>
         <w:pict>
           <v:rect style="width:0;height:1.5pt" o:hralign="center" o:hrstd="t" o:hr="t"/>
         </w:pict>
       </w:r>
     </w:p>
-    <w:bookmarkEnd w:id="104"/>
-    <w:bookmarkStart w:id="105" w:name="X9efe834f8b2cd74e0a82521118db221be51070b"/>
+    <w:bookmarkEnd w:id="128"/>
+    <w:bookmarkStart w:id="129" w:name="X9efe834f8b2cd74e0a82521118db221be51070b"/>
     <w:p>
       <w:pPr>
         <w:pStyle w:val="Heading2"/>
@@ -36737,8 +37113,8 @@
         </w:pict>
       </w:r>
     </w:p>
-    <w:bookmarkEnd w:id="105"/>
-    <w:bookmarkStart w:id="106" w:name="X22d5156c8df53bbe01e767f4ea1b46810c8c566"/>
+    <w:bookmarkEnd w:id="129"/>
+    <w:bookmarkStart w:id="130" w:name="X22d5156c8df53bbe01e767f4ea1b46810c8c566"/>
     <w:p>
       <w:pPr>
         <w:pStyle w:val="Heading2"/>
@@ -37763,8 +38139,8 @@
         </w:pict>
       </w:r>
     </w:p>
-    <w:bookmarkEnd w:id="106"/>
-    <w:bookmarkStart w:id="107" w:name="star-sé-el-código-my-friend-7"/>
+    <w:bookmarkEnd w:id="130"/>
+    <w:bookmarkStart w:id="131" w:name="star-sé-el-código-my-friend-7"/>
     <w:p>
       <w:pPr>
         <w:pStyle w:val="Heading2"/>
@@ -38532,8 +38908,8 @@
         </w:pict>
       </w:r>
     </w:p>
-    <w:bookmarkEnd w:id="107"/>
-    <w:bookmarkStart w:id="108" w:name="dart-mini-chequeo-7"/>
+    <w:bookmarkEnd w:id="131"/>
+    <w:bookmarkStart w:id="132" w:name="dart-mini-chequeo-7"/>
     <w:p>
       <w:pPr>
         <w:pStyle w:val="Heading2"/>
@@ -38887,8 +39263,8 @@
         </w:pict>
       </w:r>
     </w:p>
-    <w:bookmarkEnd w:id="108"/>
-    <w:bookmarkStart w:id="109" w:name="white_check_mark-resumen-en-3-frases-7"/>
+    <w:bookmarkEnd w:id="132"/>
+    <w:bookmarkStart w:id="133" w:name="white_check_mark-resumen-en-3-frases-7"/>
     <w:p>
       <w:pPr>
         <w:pStyle w:val="Heading2"/>
@@ -39320,7 +39696,7 @@
       <w:r>
         <w:t xml:space="preserve"> </w:t>
       </w:r>
-      <w:hyperlink r:id="rId34">
+      <w:hyperlink r:id="rId37">
         <w:r>
           <w:rPr>
             <w:rStyle w:val="Hyperlink"/>
@@ -39390,9 +39766,9 @@
         </w:pict>
       </w:r>
     </w:p>
-    <w:bookmarkEnd w:id="109"/>
-    <w:bookmarkEnd w:id="110"/>
-    <w:bookmarkStart w:id="119" w:name="X336910e743d76ded7404f3980d2944d7d18d1f5"/>
+    <w:bookmarkEnd w:id="133"/>
+    <w:bookmarkEnd w:id="134"/>
+    <w:bookmarkStart w:id="146" w:name="X336910e743d76ded7404f3980d2944d7d18d1f5"/>
     <w:p>
       <w:pPr>
         <w:pStyle w:val="Heading1"/>
@@ -39448,7 +39824,7 @@
         </w:pict>
       </w:r>
     </w:p>
-    <w:bookmarkStart w:id="111" w:name="mailbox_with_mail-la-idea-en-una-frase-8"/>
+    <w:bookmarkStart w:id="135" w:name="mailbox_with_mail-la-idea-en-una-frase-8"/>
     <w:p>
       <w:pPr>
         <w:pStyle w:val="Heading2"/>
@@ -39617,8 +39993,8 @@
         </w:pict>
       </w:r>
     </w:p>
-    <w:bookmarkEnd w:id="111"/>
-    <w:bookmarkStart w:id="112" w:name="Xaf8dc6493488a51e0264fd757553978505611b6"/>
+    <w:bookmarkEnd w:id="135"/>
+    <w:bookmarkStart w:id="136" w:name="Xaf8dc6493488a51e0264fd757553978505611b6"/>
     <w:p>
       <w:pPr>
         <w:pStyle w:val="Heading2"/>
@@ -40302,8 +40678,8 @@
         </w:pict>
       </w:r>
     </w:p>
-    <w:bookmarkEnd w:id="112"/>
-    <w:bookmarkStart w:id="113" w:name="mag-los-métodos-que-buscan"/>
+    <w:bookmarkEnd w:id="136"/>
+    <w:bookmarkStart w:id="137" w:name="mag-los-métodos-que-buscan"/>
     <w:p>
       <w:pPr>
         <w:pStyle w:val="Heading2"/>
@@ -40709,8 +41085,8 @@
         </w:pict>
       </w:r>
     </w:p>
-    <w:bookmarkEnd w:id="113"/>
-    <w:bookmarkStart w:id="114" w:name="scissors-los-métodos-que-recortan"/>
+    <w:bookmarkEnd w:id="137"/>
+    <w:bookmarkStart w:id="141" w:name="scissors-los-métodos-que-recortan"/>
     <w:p>
       <w:pPr>
         <w:pStyle w:val="Heading2"/>
@@ -41106,6 +41482,53 @@
       </w:r>
       <w:r>
         <w:t xml:space="preserve">te da los caracteres 0, 1 y 2. Es un error típico pedir un carácter de más (o de menos).</w:t>
+      </w:r>
+    </w:p>
+    <w:p>
+      <w:pPr>
+        <w:pStyle w:val="FirstParagraph"/>
+      </w:pPr>
+      <w:r>
+        <w:drawing>
+          <wp:inline>
+            <wp:extent cx="5334000" cy="2192143"/>
+            <wp:effectExtent b="0" l="0" r="0" t="0"/>
+            <wp:docPr descr="Índices de substring sobre &quot;PROGRAMA&quot;: las celdas 2 a 5 en verde forman &quot;OGRA&quot; y la celda 6 (fin) queda fuera" title="" id="139" name="Picture"/>
+            <a:graphic>
+              <a:graphicData uri="http://schemas.openxmlformats.org/drawingml/2006/picture">
+                <pic:pic>
+                  <pic:nvPicPr>
+                    <pic:cNvPr descr="C:/Users/serga/AppData/Local/Temp/opencode/docxgen/png/u03-substring-indices.png" id="140" name="Picture"/>
+                    <pic:cNvPicPr>
+                      <a:picLocks noChangeArrowheads="1" noChangeAspect="1"/>
+                    </pic:cNvPicPr>
+                  </pic:nvPicPr>
+                  <pic:blipFill>
+                    <a:blip r:embed="rId138"/>
+                    <a:stretch>
+                      <a:fillRect/>
+                    </a:stretch>
+                  </pic:blipFill>
+                  <pic:spPr bwMode="auto">
+                    <a:xfrm>
+                      <a:off x="0" y="0"/>
+                      <a:ext cx="5334000" cy="2192143"/>
+                    </a:xfrm>
+                    <a:prstGeom prst="rect">
+                      <a:avLst/>
+                    </a:prstGeom>
+                    <a:noFill/>
+                    <a:ln w="9525">
+                      <a:noFill/>
+                      <a:headEnd/>
+                      <a:tailEnd/>
+                    </a:ln>
+                  </pic:spPr>
+                </pic:pic>
+              </a:graphicData>
+            </a:graphic>
+          </wp:inline>
+        </w:drawing>
       </w:r>
     </w:p>
     <w:p>
@@ -41115,8 +41538,8 @@
         </w:pict>
       </w:r>
     </w:p>
-    <w:bookmarkEnd w:id="114"/>
-    <w:bookmarkStart w:id="115" w:name="Xeda04713b2fdc16cd3fb34979e53b643bdcafe9"/>
+    <w:bookmarkEnd w:id="141"/>
+    <w:bookmarkStart w:id="142" w:name="Xeda04713b2fdc16cd3fb34979e53b643bdcafe9"/>
     <w:p>
       <w:pPr>
         <w:pStyle w:val="Heading2"/>
@@ -42207,8 +42630,8 @@
         </w:pict>
       </w:r>
     </w:p>
-    <w:bookmarkEnd w:id="115"/>
-    <w:bookmarkStart w:id="116" w:name="star-sé-el-código-my-friend-8"/>
+    <w:bookmarkEnd w:id="142"/>
+    <w:bookmarkStart w:id="143" w:name="star-sé-el-código-my-friend-8"/>
     <w:p>
       <w:pPr>
         <w:pStyle w:val="Heading2"/>
@@ -42811,8 +43234,8 @@
         </w:pict>
       </w:r>
     </w:p>
-    <w:bookmarkEnd w:id="116"/>
-    <w:bookmarkStart w:id="117" w:name="dart-mini-chequeo-8"/>
+    <w:bookmarkEnd w:id="143"/>
+    <w:bookmarkStart w:id="144" w:name="dart-mini-chequeo-8"/>
     <w:p>
       <w:pPr>
         <w:pStyle w:val="Heading2"/>
@@ -43105,8 +43528,8 @@
         </w:pict>
       </w:r>
     </w:p>
-    <w:bookmarkEnd w:id="117"/>
-    <w:bookmarkStart w:id="118" w:name="white_check_mark-resumen-en-3-frases-8"/>
+    <w:bookmarkEnd w:id="144"/>
+    <w:bookmarkStart w:id="145" w:name="white_check_mark-resumen-en-3-frases-8"/>
     <w:p>
       <w:pPr>
         <w:pStyle w:val="Heading2"/>
@@ -43541,7 +43964,7 @@
       <w:r>
         <w:t xml:space="preserve"> </w:t>
       </w:r>
-      <w:hyperlink r:id="rId34">
+      <w:hyperlink r:id="rId37">
         <w:r>
           <w:rPr>
             <w:rStyle w:val="Hyperlink"/>
@@ -43611,9 +44034,9 @@
         </w:pict>
       </w:r>
     </w:p>
-    <w:bookmarkEnd w:id="118"/>
-    <w:bookmarkEnd w:id="119"/>
-    <w:bookmarkStart w:id="132" w:name="Xe7c59baf04fdf6f7f2b1f99a64fc2c1fba84399"/>
+    <w:bookmarkEnd w:id="145"/>
+    <w:bookmarkEnd w:id="146"/>
+    <w:bookmarkStart w:id="162" w:name="Xe7c59baf04fdf6f7f2b1f99a64fc2c1fba84399"/>
     <w:p>
       <w:pPr>
         <w:pStyle w:val="Heading1"/>
@@ -43669,7 +44092,7 @@
         </w:pict>
       </w:r>
     </w:p>
-    <w:bookmarkStart w:id="120" w:name="mailbox_with_mail-la-idea-en-una-frase-9"/>
+    <w:bookmarkStart w:id="150" w:name="mailbox_with_mail-la-idea-en-una-frase-9"/>
     <w:p>
       <w:pPr>
         <w:pStyle w:val="Heading2"/>
@@ -43694,6 +44117,53 @@
       </w:r>
       <w:r>
         <w:t xml:space="preserve">😈</w:t>
+      </w:r>
+    </w:p>
+    <w:p>
+      <w:pPr>
+        <w:pStyle w:val="FirstParagraph"/>
+      </w:pPr>
+      <w:r>
+        <w:drawing>
+          <wp:inline>
+            <wp:extent cx="5334000" cy="3156678"/>
+            <wp:effectExtent b="0" l="0" r="0" t="0"/>
+            <wp:docPr descr="Mapa mental de la unidad 03: siete zonas del temario con el error típico de cada una, de los tipos de variables a los métodos de String" title="" id="148" name="Picture"/>
+            <a:graphic>
+              <a:graphicData uri="http://schemas.openxmlformats.org/drawingml/2006/picture">
+                <pic:pic>
+                  <pic:nvPicPr>
+                    <pic:cNvPr descr="C:/Users/serga/AppData/Local/Temp/opencode/docxgen/png/u03-mapa-unidad.png" id="149" name="Picture"/>
+                    <pic:cNvPicPr>
+                      <a:picLocks noChangeArrowheads="1" noChangeAspect="1"/>
+                    </pic:cNvPicPr>
+                  </pic:nvPicPr>
+                  <pic:blipFill>
+                    <a:blip r:embed="rId147"/>
+                    <a:stretch>
+                      <a:fillRect/>
+                    </a:stretch>
+                  </pic:blipFill>
+                  <pic:spPr bwMode="auto">
+                    <a:xfrm>
+                      <a:off x="0" y="0"/>
+                      <a:ext cx="5334000" cy="3156678"/>
+                    </a:xfrm>
+                    <a:prstGeom prst="rect">
+                      <a:avLst/>
+                    </a:prstGeom>
+                    <a:noFill/>
+                    <a:ln w="9525">
+                      <a:noFill/>
+                      <a:headEnd/>
+                      <a:tailEnd/>
+                    </a:ln>
+                  </pic:spPr>
+                </pic:pic>
+              </a:graphicData>
+            </a:graphic>
+          </wp:inline>
+        </w:drawing>
       </w:r>
     </w:p>
     <w:p>
@@ -43703,8 +44173,8 @@
         </w:pict>
       </w:r>
     </w:p>
-    <w:bookmarkEnd w:id="120"/>
-    <w:bookmarkStart w:id="121" w:name="star-sé-el-código-my-friend-9"/>
+    <w:bookmarkEnd w:id="150"/>
+    <w:bookmarkStart w:id="151" w:name="star-sé-el-código-my-friend-9"/>
     <w:p>
       <w:pPr>
         <w:pStyle w:val="Heading2"/>
@@ -44668,8 +45138,8 @@
         </w:pict>
       </w:r>
     </w:p>
-    <w:bookmarkEnd w:id="121"/>
-    <w:bookmarkStart w:id="122" w:name="fire-fireside-chat-int-vs-double"/>
+    <w:bookmarkEnd w:id="151"/>
+    <w:bookmarkStart w:id="152" w:name="fire-fireside-chat-int-vs-double"/>
     <w:p>
       <w:pPr>
         <w:pStyle w:val="Heading2"/>
@@ -44996,8 +45466,8 @@
         </w:pict>
       </w:r>
     </w:p>
-    <w:bookmarkEnd w:id="122"/>
-    <w:bookmarkStart w:id="123" w:name="detective-quién-soy"/>
+    <w:bookmarkEnd w:id="152"/>
+    <w:bookmarkStart w:id="153" w:name="detective-quién-soy"/>
     <w:p>
       <w:pPr>
         <w:pStyle w:val="Heading2"/>
@@ -45357,8 +45827,8 @@
         </w:pict>
       </w:r>
     </w:p>
-    <w:bookmarkEnd w:id="123"/>
-    <w:bookmarkStart w:id="124" w:name="X80500c62dcb1b8161929319729ad528839aa6ee"/>
+    <w:bookmarkEnd w:id="153"/>
+    <w:bookmarkStart w:id="154" w:name="X80500c62dcb1b8161929319729ad528839aa6ee"/>
     <w:p>
       <w:pPr>
         <w:pStyle w:val="Heading2"/>
@@ -45657,8 +46127,8 @@
         </w:pict>
       </w:r>
     </w:p>
-    <w:bookmarkEnd w:id="124"/>
-    <w:bookmarkStart w:id="125" w:name="Xfe7ecb9063b0bcc60b14b4c7898c9025a5e38b1"/>
+    <w:bookmarkEnd w:id="154"/>
+    <w:bookmarkStart w:id="155" w:name="Xfe7ecb9063b0bcc60b14b4c7898c9025a5e38b1"/>
     <w:p>
       <w:pPr>
         <w:pStyle w:val="Heading2"/>
@@ -47366,8 +47836,8 @@
         </w:pict>
       </w:r>
     </w:p>
-    <w:bookmarkEnd w:id="125"/>
-    <w:bookmarkStart w:id="126" w:name="trophy-logros-de-esta-unidad"/>
+    <w:bookmarkEnd w:id="155"/>
+    <w:bookmarkStart w:id="156" w:name="trophy-logros-de-esta-unidad"/>
     <w:p>
       <w:pPr>
         <w:pStyle w:val="Heading2"/>
@@ -47651,8 +48121,8 @@
         </w:pict>
       </w:r>
     </w:p>
-    <w:bookmarkEnd w:id="126"/>
-    <w:bookmarkStart w:id="127" w:name="brain-atrévete-a-pensar"/>
+    <w:bookmarkEnd w:id="156"/>
+    <w:bookmarkStart w:id="157" w:name="brain-atrévete-a-pensar"/>
     <w:p>
       <w:pPr>
         <w:pStyle w:val="Heading2"/>
@@ -48869,8 +49339,8 @@
         </w:pict>
       </w:r>
     </w:p>
-    <w:bookmarkEnd w:id="127"/>
-    <w:bookmarkStart w:id="128" w:name="jigsaw-crucigrama-de-bits"/>
+    <w:bookmarkEnd w:id="157"/>
+    <w:bookmarkStart w:id="158" w:name="jigsaw-crucigrama-de-bits"/>
     <w:p>
       <w:pPr>
         <w:pStyle w:val="Heading2"/>
@@ -49018,8 +49488,8 @@
         </w:pict>
       </w:r>
     </w:p>
-    <w:bookmarkEnd w:id="128"/>
-    <w:bookmarkStart w:id="129" w:name="X54941ca134600f7ce696d01f19e3eb1d1fc3318"/>
+    <w:bookmarkEnd w:id="158"/>
+    <w:bookmarkStart w:id="159" w:name="X54941ca134600f7ce696d01f19e3eb1d1fc3318"/>
     <w:p>
       <w:pPr>
         <w:pStyle w:val="Heading2"/>
@@ -49305,8 +49775,8 @@
         </w:pict>
       </w:r>
     </w:p>
-    <w:bookmarkEnd w:id="129"/>
-    <w:bookmarkStart w:id="130" w:name="shrug-no-hay-preguntas-tontas"/>
+    <w:bookmarkEnd w:id="159"/>
+    <w:bookmarkStart w:id="160" w:name="shrug-no-hay-preguntas-tontas"/>
     <w:p>
       <w:pPr>
         <w:pStyle w:val="Heading2"/>
@@ -49911,8 +50381,8 @@
         </w:pict>
       </w:r>
     </w:p>
-    <w:bookmarkEnd w:id="130"/>
-    <w:bookmarkStart w:id="131" w:name="clapper-poscréditos"/>
+    <w:bookmarkEnd w:id="160"/>
+    <w:bookmarkStart w:id="161" w:name="clapper-poscréditos"/>
     <w:p>
       <w:pPr>
         <w:pStyle w:val="Heading2"/>
@@ -50195,7 +50665,7 @@
       <w:r>
         <w:t xml:space="preserve"> </w:t>
       </w:r>
-      <w:hyperlink r:id="rId34">
+      <w:hyperlink r:id="rId37">
         <w:r>
           <w:rPr>
             <w:rStyle w:val="Hyperlink"/>
@@ -50260,8 +50730,8 @@
         </w:r>
       </w:hyperlink>
     </w:p>
-    <w:bookmarkEnd w:id="131"/>
-    <w:bookmarkEnd w:id="132"/>
+    <w:bookmarkEnd w:id="161"/>
+    <w:bookmarkEnd w:id="162"/>
     <w:sectPr>
       <w:footnotePr>
         <w:numRestart w:val="eachSect"/>

</xml_diff>